<commit_message>
court(uscfc) complaint: typst/latex/docx on the shared cross-engine layout model; XENG-001..003 pass on latex and docx, params.cross_engine: gate (fb-595.54.6)
</commit_message>
<xml_diff>
--- a/courts/federal-circuit/court-of-federal-claims/complaint/docx/reference.docx
+++ b/courts/federal-circuit/court-of-federal-claims/complaint/docx/reference.docx
@@ -315,11 +315,8 @@
     </w:p>
     <w:sectPr>
       <w:footerReference w:type="default" r:id="rIdFooter1"/>
-      <w:footnotePr>
-        <w:numRestart w:val="eachSect"/>
-      </w:footnotePr>
       <w:pgSz w:w="12240" w:h="15840"/>
-      <w:pgMar w:top="1440" w:right="1440" w:bottom="1440" w:left="1440" w:header="720" w:footer="720" w:gutter="0"/>
+      <w:pgMar w:top="1440" w:right="1440" w:bottom="1440" w:left="1440" w:header="720" w:footer="432" w:gutter="0"/>
     </w:sectPr>
   </w:body>
 </w:document>
@@ -513,15 +510,16 @@
   <w:docDefaults>
     <w:rPrDefault>
       <w:rPr>
-        <w:rFonts w:ascii="EB Garamond" w:hAnsi="EB Garamond" w:eastAsia="EB Garamond" w:cs="EB Garamond"/>
+        <w:rFonts w:ascii="Times New Roman" w:hAnsi="Times New Roman" w:eastAsia="Times New Roman" w:cs="Times New Roman"/>
         <w:sz w:val="24"/>
         <w:szCs w:val="24"/>
-        <w:lang w:val="en-US" w:eastAsia="en-US" w:bidi="ar-SA"/>
+        <w:lang w:val="en-US" w:eastAsia="zh-CN" w:bidi="ar-SA"/>
       </w:rPr>
     </w:rPrDefault>
     <w:pPrDefault>
       <w:pPr>
-        <w:spacing w:after="0" w:line="240" w:lineRule="auto"/>
+        <w:widowControl/>
+        <w:spacing w:after="0"/>
       </w:pPr>
     </w:pPrDefault>
   </w:docDefaults>
@@ -533,11 +531,11 @@
   <w:style w:type="paragraph" w:styleId="BodyText">
     <w:name w:val="Body Text"/>
     <w:basedOn w:val="Normal"/>
+    <w:link w:val="BodyTextChar"/>
     <w:qFormat/>
     <w:pPr>
       <w:spacing w:before="0" w:after="0" w:line="552" w:lineRule="exact"/>
       <w:ind w:firstLine="720"/>
-      <w:jc w:val="both"/>
     </w:pPr>
   </w:style>
   <w:style w:type="paragraph" w:customStyle="1" w:styleId="FirstParagraph">
@@ -550,6 +548,9 @@
     <w:name w:val="Compact"/>
     <w:basedOn w:val="BodyText"/>
     <w:qFormat/>
+    <w:pPr>
+      <w:spacing w:before="36" w:after="36"/>
+    </w:pPr>
   </w:style>
   <w:style w:type="paragraph" w:styleId="Title">
     <w:name w:val="Title"/>
@@ -688,18 +689,20 @@
     <w:name w:val="heading 1"/>
     <w:basedOn w:val="Normal"/>
     <w:next w:val="BodyText"/>
-    <w:uiPriority w:val="9"/>
-    <w:qFormat/>
+    <w:link w:val="Heading1Char"/>
+    <w:uiPriority w:val="9"/>
+    <w:qFormat/>
+    <w:rsid w:val="00A10FD9"/>
     <w:pPr>
       <w:keepNext/>
       <w:keepLines/>
-      <w:spacing w:before="552" w:after="115" w:line="276" w:lineRule="exact"/>
+      <w:spacing w:before="552" w:after="276" w:line="276" w:lineRule="exact"/>
       <w:ind w:firstLine="0"/>
       <w:jc w:val="center"/>
       <w:outlineLvl w:val="0"/>
     </w:pPr>
     <w:rPr>
-      <w:rFonts w:ascii="EB Garamond" w:hAnsi="EB Garamond" w:eastAsia="EB Garamond" w:cs="EB Garamond"/>
+      <w:rFonts w:ascii="Times New Roman" w:hAnsi="Times New Roman" w:eastAsia="Times New Roman" w:cs="Times New Roman"/>
       <w:b/>
       <w:bCs/>
       <w:caps/>
@@ -712,42 +715,21 @@
     <w:name w:val="heading 2"/>
     <w:basedOn w:val="Normal"/>
     <w:next w:val="BodyText"/>
-    <w:uiPriority w:val="9"/>
-    <w:qFormat/>
+    <w:link w:val="Heading2Char"/>
+    <w:uiPriority w:val="9"/>
+    <w:semiHidden/>
+    <w:unhideWhenUsed/>
+    <w:qFormat/>
+    <w:rsid w:val="00A10FD9"/>
     <w:pPr>
       <w:keepNext/>
       <w:keepLines/>
-      <w:spacing w:before="552" w:after="115" w:line="276" w:lineRule="exact"/>
+      <w:spacing w:before="552" w:after="276" w:line="276" w:lineRule="exact"/>
       <w:ind w:firstLine="0"/>
-      <w:jc w:val="center"/>
       <w:outlineLvl w:val="1"/>
     </w:pPr>
     <w:rPr>
-      <w:rFonts w:ascii="EB Garamond" w:hAnsi="EB Garamond" w:eastAsia="EB Garamond" w:cs="EB Garamond"/>
-      <w:b/>
-      <w:bCs/>
-      <w:caps/>
-      <w:color w:val="000000"/>
-      <w:sz w:val="24"/>
-      <w:szCs w:val="24"/>
-    </w:rPr>
-  </w:style>
-  <w:style w:type="paragraph" w:styleId="Heading3">
-    <w:name w:val="heading 3"/>
-    <w:basedOn w:val="Normal"/>
-    <w:next w:val="BodyText"/>
-    <w:uiPriority w:val="9"/>
-    <w:qFormat/>
-    <w:pPr>
-      <w:keepNext/>
-      <w:keepLines/>
-      <w:spacing w:before="552" w:after="115" w:line="276" w:lineRule="exact"/>
-      <w:ind w:firstLine="0"/>
-      <w:jc w:val="left"/>
-      <w:outlineLvl w:val="2"/>
-    </w:pPr>
-    <w:rPr>
-      <w:rFonts w:ascii="EB Garamond" w:hAnsi="EB Garamond" w:eastAsia="EB Garamond" w:cs="EB Garamond"/>
+      <w:rFonts w:ascii="Times New Roman" w:hAnsi="Times New Roman" w:eastAsia="Times New Roman" w:cs="Times New Roman"/>
       <w:b/>
       <w:bCs/>
       <w:color w:val="000000"/>
@@ -755,6 +737,32 @@
       <w:szCs w:val="24"/>
     </w:rPr>
   </w:style>
+  <w:style w:type="paragraph" w:styleId="Heading3">
+    <w:name w:val="heading 3"/>
+    <w:basedOn w:val="Normal"/>
+    <w:next w:val="BodyText"/>
+    <w:link w:val="Heading3Char"/>
+    <w:uiPriority w:val="9"/>
+    <w:semiHidden/>
+    <w:unhideWhenUsed/>
+    <w:qFormat/>
+    <w:rsid w:val="00A10FD9"/>
+    <w:pPr>
+      <w:keepNext/>
+      <w:keepLines/>
+      <w:spacing w:before="552" w:after="276" w:line="276" w:lineRule="exact"/>
+      <w:ind w:firstLine="0"/>
+      <w:outlineLvl w:val="2"/>
+    </w:pPr>
+    <w:rPr>
+      <w:rFonts w:ascii="Times New Roman" w:hAnsi="Times New Roman" w:eastAsia="Times New Roman" w:cs="Times New Roman"/>
+      <w:b/>
+      <w:bCs/>
+      <w:color w:val="000000"/>
+      <w:sz w:val="24"/>
+      <w:szCs w:val="24"/>
+    </w:rPr>
+  </w:style>
   <w:style w:type="paragraph" w:styleId="Heading4">
     <w:name w:val="heading 4"/>
     <w:basedOn w:val="Normal"/>
@@ -768,9 +776,183 @@
     <w:pPr>
       <w:keepNext/>
       <w:keepLines/>
-      <w:spacing w:before="80" w:after="40"/>
+      <w:spacing w:before="552" w:after="276" w:line="276" w:lineRule="exact"/>
+      <w:ind w:firstLine="0"/>
       <w:outlineLvl w:val="3"/>
     </w:pPr>
+    <w:rPr>
+      <w:rFonts w:ascii="Times New Roman" w:hAnsi="Times New Roman" w:eastAsia="Times New Roman" w:cs="Times New Roman"/>
+      <w:b/>
+      <w:bCs/>
+      <w:i/>
+      <w:color w:val="000000"/>
+      <w:sz w:val="24"/>
+      <w:szCs w:val="24"/>
+    </w:rPr>
+  </w:style>
+  <w:style w:type="paragraph" w:styleId="Heading5">
+    <w:name w:val="heading 5"/>
+    <w:basedOn w:val="Normal"/>
+    <w:next w:val="BodyText"/>
+    <w:link w:val="Heading5Char"/>
+    <w:uiPriority w:val="9"/>
+    <w:semiHidden/>
+    <w:unhideWhenUsed/>
+    <w:qFormat/>
+    <w:rsid w:val="00A10FD9"/>
+    <w:pPr>
+      <w:keepNext/>
+      <w:keepLines/>
+      <w:spacing w:before="552" w:after="276" w:line="276" w:lineRule="exact"/>
+      <w:ind w:firstLine="0"/>
+      <w:outlineLvl w:val="4"/>
+    </w:pPr>
+    <w:rPr>
+      <w:rFonts w:ascii="Times New Roman" w:hAnsi="Times New Roman" w:eastAsia="Times New Roman" w:cs="Times New Roman"/>
+      <w:b/>
+      <w:bCs/>
+      <w:i/>
+      <w:color w:val="000000"/>
+      <w:sz w:val="24"/>
+      <w:szCs w:val="24"/>
+    </w:rPr>
+  </w:style>
+  <w:style w:type="paragraph" w:styleId="Heading6">
+    <w:name w:val="heading 6"/>
+    <w:basedOn w:val="Normal"/>
+    <w:next w:val="BodyText"/>
+    <w:link w:val="Heading6Char"/>
+    <w:uiPriority w:val="9"/>
+    <w:semiHidden/>
+    <w:unhideWhenUsed/>
+    <w:qFormat/>
+    <w:rsid w:val="00A10FD9"/>
+    <w:pPr>
+      <w:keepNext/>
+      <w:keepLines/>
+      <w:spacing w:before="40" w:after="0"/>
+      <w:outlineLvl w:val="5"/>
+    </w:pPr>
+    <w:rPr>
+      <w:rFonts w:eastAsiaTheme="majorEastAsia" w:cstheme="majorBidi"/>
+      <w:i/>
+      <w:iCs/>
+      <w:color w:val="595959" w:themeColor="text1" w:themeTint="A6"/>
+    </w:rPr>
+  </w:style>
+  <w:style w:type="paragraph" w:styleId="Heading7">
+    <w:name w:val="heading 7"/>
+    <w:basedOn w:val="Normal"/>
+    <w:next w:val="BodyText"/>
+    <w:link w:val="Heading7Char"/>
+    <w:uiPriority w:val="9"/>
+    <w:semiHidden/>
+    <w:unhideWhenUsed/>
+    <w:qFormat/>
+    <w:rsid w:val="00A10FD9"/>
+    <w:pPr>
+      <w:keepNext/>
+      <w:keepLines/>
+      <w:spacing w:before="40" w:after="0"/>
+      <w:outlineLvl w:val="6"/>
+    </w:pPr>
+    <w:rPr>
+      <w:rFonts w:eastAsiaTheme="majorEastAsia" w:cstheme="majorBidi"/>
+      <w:color w:val="595959" w:themeColor="text1" w:themeTint="A6"/>
+    </w:rPr>
+  </w:style>
+  <w:style w:type="paragraph" w:styleId="Heading8">
+    <w:name w:val="heading 8"/>
+    <w:basedOn w:val="Normal"/>
+    <w:next w:val="BodyText"/>
+    <w:link w:val="Heading8Char"/>
+    <w:uiPriority w:val="9"/>
+    <w:semiHidden/>
+    <w:unhideWhenUsed/>
+    <w:qFormat/>
+    <w:rsid w:val="00A10FD9"/>
+    <w:pPr>
+      <w:keepNext/>
+      <w:keepLines/>
+      <w:spacing w:after="0"/>
+      <w:outlineLvl w:val="7"/>
+    </w:pPr>
+    <w:rPr>
+      <w:rFonts w:eastAsiaTheme="majorEastAsia" w:cstheme="majorBidi"/>
+      <w:i/>
+      <w:iCs/>
+      <w:color w:val="272727" w:themeColor="text1" w:themeTint="D8"/>
+    </w:rPr>
+  </w:style>
+  <w:style w:type="paragraph" w:styleId="Heading9">
+    <w:name w:val="heading 9"/>
+    <w:basedOn w:val="Normal"/>
+    <w:next w:val="BodyText"/>
+    <w:link w:val="Heading9Char"/>
+    <w:uiPriority w:val="9"/>
+    <w:semiHidden/>
+    <w:unhideWhenUsed/>
+    <w:qFormat/>
+    <w:rsid w:val="00A10FD9"/>
+    <w:pPr>
+      <w:keepNext/>
+      <w:keepLines/>
+      <w:spacing w:after="0"/>
+      <w:outlineLvl w:val="8"/>
+    </w:pPr>
+    <w:rPr>
+      <w:rFonts w:eastAsiaTheme="majorEastAsia" w:cstheme="majorBidi"/>
+      <w:color w:val="272727" w:themeColor="text1" w:themeTint="D8"/>
+    </w:rPr>
+  </w:style>
+  <w:style w:type="character" w:customStyle="1" w:styleId="Heading1Char">
+    <w:name w:val="Heading 1 Char"/>
+    <w:basedOn w:val="DefaultParagraphFont"/>
+    <w:link w:val="Heading1"/>
+    <w:uiPriority w:val="9"/>
+    <w:rsid w:val="00A10FD9"/>
+    <w:rPr>
+      <w:rFonts w:asciiTheme="majorHAnsi" w:eastAsiaTheme="majorEastAsia" w:hAnsiTheme="majorHAnsi" w:cstheme="majorBidi"/>
+      <w:color w:val="0F4761" w:themeColor="accent1" w:themeShade="BF"/>
+      <w:sz w:val="40"/>
+      <w:szCs w:val="40"/>
+    </w:rPr>
+  </w:style>
+  <w:style w:type="character" w:customStyle="1" w:styleId="Heading2Char">
+    <w:name w:val="Heading 2 Char"/>
+    <w:basedOn w:val="DefaultParagraphFont"/>
+    <w:link w:val="Heading2"/>
+    <w:uiPriority w:val="9"/>
+    <w:semiHidden/>
+    <w:rsid w:val="00A10FD9"/>
+    <w:rPr>
+      <w:rFonts w:asciiTheme="majorHAnsi" w:eastAsiaTheme="majorEastAsia" w:hAnsiTheme="majorHAnsi" w:cstheme="majorBidi"/>
+      <w:color w:val="0F4761" w:themeColor="accent1" w:themeShade="BF"/>
+      <w:sz w:val="32"/>
+      <w:szCs w:val="32"/>
+    </w:rPr>
+  </w:style>
+  <w:style w:type="character" w:customStyle="1" w:styleId="Heading3Char">
+    <w:name w:val="Heading 3 Char"/>
+    <w:basedOn w:val="DefaultParagraphFont"/>
+    <w:link w:val="Heading3"/>
+    <w:uiPriority w:val="9"/>
+    <w:semiHidden/>
+    <w:rsid w:val="00A10FD9"/>
+    <w:rPr>
+      <w:rFonts w:eastAsiaTheme="majorEastAsia" w:cstheme="majorBidi"/>
+      <w:color w:val="0F4761" w:themeColor="accent1" w:themeShade="BF"/>
+      <w:sz w:val="28"/>
+      <w:szCs w:val="28"/>
+    </w:rPr>
+  </w:style>
+  <w:style w:type="character" w:customStyle="1" w:styleId="Heading4Char">
+    <w:name w:val="Heading 4 Char"/>
+    <w:basedOn w:val="DefaultParagraphFont"/>
+    <w:link w:val="Heading4"/>
+    <w:uiPriority w:val="9"/>
+    <w:semiHidden/>
+    <w:rsid w:val="00A10FD9"/>
     <w:rPr>
       <w:rFonts w:eastAsiaTheme="majorEastAsia" w:cstheme="majorBidi"/>
       <w:i/>
@@ -778,43 +960,25 @@
       <w:color w:val="0F4761" w:themeColor="accent1" w:themeShade="BF"/>
     </w:rPr>
   </w:style>
-  <w:style w:type="paragraph" w:styleId="Heading5">
-    <w:name w:val="heading 5"/>
-    <w:basedOn w:val="Normal"/>
-    <w:next w:val="BodyText"/>
-    <w:link w:val="Heading5Char"/>
-    <w:uiPriority w:val="9"/>
-    <w:semiHidden/>
-    <w:unhideWhenUsed/>
-    <w:qFormat/>
-    <w:rsid w:val="00A10FD9"/>
-    <w:pPr>
-      <w:keepNext/>
-      <w:keepLines/>
-      <w:spacing w:before="80" w:after="40"/>
-      <w:outlineLvl w:val="4"/>
-    </w:pPr>
+  <w:style w:type="character" w:customStyle="1" w:styleId="Heading5Char">
+    <w:name w:val="Heading 5 Char"/>
+    <w:basedOn w:val="DefaultParagraphFont"/>
+    <w:link w:val="Heading5"/>
+    <w:uiPriority w:val="9"/>
+    <w:semiHidden/>
+    <w:rsid w:val="00A10FD9"/>
     <w:rPr>
       <w:rFonts w:eastAsiaTheme="majorEastAsia" w:cstheme="majorBidi"/>
       <w:color w:val="0F4761" w:themeColor="accent1" w:themeShade="BF"/>
     </w:rPr>
   </w:style>
-  <w:style w:type="paragraph" w:styleId="Heading6">
-    <w:name w:val="heading 6"/>
-    <w:basedOn w:val="Normal"/>
-    <w:next w:val="BodyText"/>
-    <w:link w:val="Heading6Char"/>
-    <w:uiPriority w:val="9"/>
-    <w:semiHidden/>
-    <w:unhideWhenUsed/>
-    <w:qFormat/>
-    <w:rsid w:val="00A10FD9"/>
-    <w:pPr>
-      <w:keepNext/>
-      <w:keepLines/>
-      <w:spacing w:before="40" w:after="0"/>
-      <w:outlineLvl w:val="5"/>
-    </w:pPr>
+  <w:style w:type="character" w:customStyle="1" w:styleId="Heading6Char">
+    <w:name w:val="Heading 6 Char"/>
+    <w:basedOn w:val="DefaultParagraphFont"/>
+    <w:link w:val="Heading6"/>
+    <w:uiPriority w:val="9"/>
+    <w:semiHidden/>
+    <w:rsid w:val="00A10FD9"/>
     <w:rPr>
       <w:rFonts w:eastAsiaTheme="majorEastAsia" w:cstheme="majorBidi"/>
       <w:i/>
@@ -822,43 +986,25 @@
       <w:color w:val="595959" w:themeColor="text1" w:themeTint="A6"/>
     </w:rPr>
   </w:style>
-  <w:style w:type="paragraph" w:styleId="Heading7">
-    <w:name w:val="heading 7"/>
-    <w:basedOn w:val="Normal"/>
-    <w:next w:val="BodyText"/>
-    <w:link w:val="Heading7Char"/>
-    <w:uiPriority w:val="9"/>
-    <w:semiHidden/>
-    <w:unhideWhenUsed/>
-    <w:qFormat/>
-    <w:rsid w:val="00A10FD9"/>
-    <w:pPr>
-      <w:keepNext/>
-      <w:keepLines/>
-      <w:spacing w:before="40" w:after="0"/>
-      <w:outlineLvl w:val="6"/>
-    </w:pPr>
+  <w:style w:type="character" w:customStyle="1" w:styleId="Heading7Char">
+    <w:name w:val="Heading 7 Char"/>
+    <w:basedOn w:val="DefaultParagraphFont"/>
+    <w:link w:val="Heading7"/>
+    <w:uiPriority w:val="9"/>
+    <w:semiHidden/>
+    <w:rsid w:val="00A10FD9"/>
     <w:rPr>
       <w:rFonts w:eastAsiaTheme="majorEastAsia" w:cstheme="majorBidi"/>
       <w:color w:val="595959" w:themeColor="text1" w:themeTint="A6"/>
     </w:rPr>
   </w:style>
-  <w:style w:type="paragraph" w:styleId="Heading8">
-    <w:name w:val="heading 8"/>
-    <w:basedOn w:val="Normal"/>
-    <w:next w:val="BodyText"/>
-    <w:link w:val="Heading8Char"/>
-    <w:uiPriority w:val="9"/>
-    <w:semiHidden/>
-    <w:unhideWhenUsed/>
-    <w:qFormat/>
-    <w:rsid w:val="00A10FD9"/>
-    <w:pPr>
-      <w:keepNext/>
-      <w:keepLines/>
-      <w:spacing w:after="0"/>
-      <w:outlineLvl w:val="7"/>
-    </w:pPr>
+  <w:style w:type="character" w:customStyle="1" w:styleId="Heading8Char">
+    <w:name w:val="Heading 8 Char"/>
+    <w:basedOn w:val="DefaultParagraphFont"/>
+    <w:link w:val="Heading8"/>
+    <w:uiPriority w:val="9"/>
+    <w:semiHidden/>
+    <w:rsid w:val="00A10FD9"/>
     <w:rPr>
       <w:rFonts w:eastAsiaTheme="majorEastAsia" w:cstheme="majorBidi"/>
       <w:i/>
@@ -866,134 +1012,6 @@
       <w:color w:val="272727" w:themeColor="text1" w:themeTint="D8"/>
     </w:rPr>
   </w:style>
-  <w:style w:type="paragraph" w:styleId="Heading9">
-    <w:name w:val="heading 9"/>
-    <w:basedOn w:val="Normal"/>
-    <w:next w:val="BodyText"/>
-    <w:link w:val="Heading9Char"/>
-    <w:uiPriority w:val="9"/>
-    <w:semiHidden/>
-    <w:unhideWhenUsed/>
-    <w:qFormat/>
-    <w:rsid w:val="00A10FD9"/>
-    <w:pPr>
-      <w:keepNext/>
-      <w:keepLines/>
-      <w:spacing w:after="0"/>
-      <w:outlineLvl w:val="8"/>
-    </w:pPr>
-    <w:rPr>
-      <w:rFonts w:eastAsiaTheme="majorEastAsia" w:cstheme="majorBidi"/>
-      <w:color w:val="272727" w:themeColor="text1" w:themeTint="D8"/>
-    </w:rPr>
-  </w:style>
-  <w:style w:type="character" w:customStyle="1" w:styleId="Heading1Char">
-    <w:name w:val="Heading 1 Char"/>
-    <w:basedOn w:val="DefaultParagraphFont"/>
-    <w:link w:val="Heading1"/>
-    <w:uiPriority w:val="9"/>
-    <w:rsid w:val="00A10FD9"/>
-    <w:rPr>
-      <w:rFonts w:asciiTheme="majorHAnsi" w:eastAsiaTheme="majorEastAsia" w:hAnsiTheme="majorHAnsi" w:cstheme="majorBidi"/>
-      <w:color w:val="0F4761" w:themeColor="accent1" w:themeShade="BF"/>
-      <w:sz w:val="40"/>
-      <w:szCs w:val="40"/>
-    </w:rPr>
-  </w:style>
-  <w:style w:type="character" w:customStyle="1" w:styleId="Heading2Char">
-    <w:name w:val="Heading 2 Char"/>
-    <w:basedOn w:val="DefaultParagraphFont"/>
-    <w:link w:val="Heading2"/>
-    <w:uiPriority w:val="9"/>
-    <w:semiHidden/>
-    <w:rsid w:val="00A10FD9"/>
-    <w:rPr>
-      <w:rFonts w:asciiTheme="majorHAnsi" w:eastAsiaTheme="majorEastAsia" w:hAnsiTheme="majorHAnsi" w:cstheme="majorBidi"/>
-      <w:color w:val="0F4761" w:themeColor="accent1" w:themeShade="BF"/>
-      <w:sz w:val="32"/>
-      <w:szCs w:val="32"/>
-    </w:rPr>
-  </w:style>
-  <w:style w:type="character" w:customStyle="1" w:styleId="Heading3Char">
-    <w:name w:val="Heading 3 Char"/>
-    <w:basedOn w:val="DefaultParagraphFont"/>
-    <w:link w:val="Heading3"/>
-    <w:uiPriority w:val="9"/>
-    <w:semiHidden/>
-    <w:rsid w:val="00A10FD9"/>
-    <w:rPr>
-      <w:rFonts w:eastAsiaTheme="majorEastAsia" w:cstheme="majorBidi"/>
-      <w:color w:val="0F4761" w:themeColor="accent1" w:themeShade="BF"/>
-      <w:sz w:val="28"/>
-      <w:szCs w:val="28"/>
-    </w:rPr>
-  </w:style>
-  <w:style w:type="character" w:customStyle="1" w:styleId="Heading4Char">
-    <w:name w:val="Heading 4 Char"/>
-    <w:basedOn w:val="DefaultParagraphFont"/>
-    <w:link w:val="Heading4"/>
-    <w:uiPriority w:val="9"/>
-    <w:semiHidden/>
-    <w:rsid w:val="00A10FD9"/>
-    <w:rPr>
-      <w:rFonts w:eastAsiaTheme="majorEastAsia" w:cstheme="majorBidi"/>
-      <w:i/>
-      <w:iCs/>
-      <w:color w:val="0F4761" w:themeColor="accent1" w:themeShade="BF"/>
-    </w:rPr>
-  </w:style>
-  <w:style w:type="character" w:customStyle="1" w:styleId="Heading5Char">
-    <w:name w:val="Heading 5 Char"/>
-    <w:basedOn w:val="DefaultParagraphFont"/>
-    <w:link w:val="Heading5"/>
-    <w:uiPriority w:val="9"/>
-    <w:semiHidden/>
-    <w:rsid w:val="00A10FD9"/>
-    <w:rPr>
-      <w:rFonts w:eastAsiaTheme="majorEastAsia" w:cstheme="majorBidi"/>
-      <w:color w:val="0F4761" w:themeColor="accent1" w:themeShade="BF"/>
-    </w:rPr>
-  </w:style>
-  <w:style w:type="character" w:customStyle="1" w:styleId="Heading6Char">
-    <w:name w:val="Heading 6 Char"/>
-    <w:basedOn w:val="DefaultParagraphFont"/>
-    <w:link w:val="Heading6"/>
-    <w:uiPriority w:val="9"/>
-    <w:semiHidden/>
-    <w:rsid w:val="00A10FD9"/>
-    <w:rPr>
-      <w:rFonts w:eastAsiaTheme="majorEastAsia" w:cstheme="majorBidi"/>
-      <w:i/>
-      <w:iCs/>
-      <w:color w:val="595959" w:themeColor="text1" w:themeTint="A6"/>
-    </w:rPr>
-  </w:style>
-  <w:style w:type="character" w:customStyle="1" w:styleId="Heading7Char">
-    <w:name w:val="Heading 7 Char"/>
-    <w:basedOn w:val="DefaultParagraphFont"/>
-    <w:link w:val="Heading7"/>
-    <w:uiPriority w:val="9"/>
-    <w:semiHidden/>
-    <w:rsid w:val="00A10FD9"/>
-    <w:rPr>
-      <w:rFonts w:eastAsiaTheme="majorEastAsia" w:cstheme="majorBidi"/>
-      <w:color w:val="595959" w:themeColor="text1" w:themeTint="A6"/>
-    </w:rPr>
-  </w:style>
-  <w:style w:type="character" w:customStyle="1" w:styleId="Heading8Char">
-    <w:name w:val="Heading 8 Char"/>
-    <w:basedOn w:val="DefaultParagraphFont"/>
-    <w:link w:val="Heading8"/>
-    <w:uiPriority w:val="9"/>
-    <w:semiHidden/>
-    <w:rsid w:val="00A10FD9"/>
-    <w:rPr>
-      <w:rFonts w:eastAsiaTheme="majorEastAsia" w:cstheme="majorBidi"/>
-      <w:i/>
-      <w:iCs/>
-      <w:color w:val="272727" w:themeColor="text1" w:themeTint="D8"/>
-    </w:rPr>
-  </w:style>
   <w:style w:type="character" w:customStyle="1" w:styleId="Heading9Char">
     <w:name w:val="Heading 9 Char"/>
     <w:basedOn w:val="DefaultParagraphFont"/>
@@ -1006,15 +1024,25 @@
       <w:color w:val="272727" w:themeColor="text1" w:themeTint="D8"/>
     </w:rPr>
   </w:style>
+  <w:style w:type="paragraph" w:customStyle="1" w:styleId="ListItem">
+    <w:name w:val="List Item"/>
+    <w:basedOn w:val="BodyText"/>
+    <w:qFormat/>
+    <w:pPr>
+      <w:spacing w:before="0" w:after="0" w:line="552" w:lineRule="exact"/>
+      <w:ind w:left="720" w:hanging="720"/>
+    </w:pPr>
+  </w:style>
   <w:style w:type="paragraph" w:styleId="BlockText">
     <w:name w:val="Block Text"/>
     <w:basedOn w:val="BodyText"/>
     <w:next w:val="BodyText"/>
-    <w:qFormat/>
-    <w:pPr>
-      <w:spacing w:before="0" w:after="276" w:line="276" w:lineRule="exact"/>
-      <w:ind w:left="720" w:right="720" w:firstLine="0"/>
-      <w:jc w:val="left"/>
+    <w:uiPriority w:val="9"/>
+    <w:unhideWhenUsed/>
+    <w:qFormat/>
+    <w:pPr>
+      <w:spacing w:before="276" w:after="276" w:line="276" w:lineRule="exact"/>
+      <w:ind w:firstLine="0" w:left="720" w:right="720"/>
     </w:pPr>
   </w:style>
   <w:style w:type="paragraph" w:styleId="FootnoteText">
@@ -1025,8 +1053,8 @@
     <w:unhideWhenUsed/>
     <w:qFormat/>
     <w:pPr>
+      <w:keepLines/>
       <w:spacing w:before="0" w:after="120" w:line="276" w:lineRule="exact"/>
-      <w:jc w:val="both"/>
     </w:pPr>
     <w:rPr>
       <w:sz w:val="24"/>
@@ -1041,8 +1069,8 @@
     <w:unhideWhenUsed/>
     <w:qFormat/>
     <w:pPr>
-      <w:spacing w:before="100" w:after="100"/>
-      <w:ind w:firstLine="0" w:left="480" w:right="480"/>
+      <w:spacing w:before="276" w:after="276"/>
+      <w:ind w:firstLine="0" w:left="720" w:right="720"/>
     </w:pPr>
   </w:style>
   <w:style w:type="character" w:default="1" w:styleId="DefaultParagraphFont">
@@ -1150,7 +1178,7 @@
     <w:name w:val="Hyperlink"/>
     <w:basedOn w:val="BodyTextChar"/>
     <w:rPr>
-      <w:color w:val="4F81BD" w:themeColor="accent1"/>
+      <w:color w:val="000000"/>
     </w:rPr>
   </w:style>
   <w:style w:type="paragraph" w:styleId="TOCHeading">
@@ -1171,30 +1199,12 @@
       <w:color w:val="365F91" w:themeColor="accent1" w:themeShade="BF"/>
     </w:rPr>
   </w:style>
-  <w:style w:type="paragraph" w:customStyle="1" w:styleId="PrayerItem">
-    <w:name w:val="Prayer Item"/>
+  <w:style w:type="paragraph" w:customStyle="1" w:styleId="BodyTextNote">
+    <w:name w:val="Body Text Note"/>
     <w:basedOn w:val="BodyText"/>
     <w:qFormat/>
     <w:pPr>
-      <w:ind w:left="840" w:firstLine="0"/>
-    </w:pPr>
-  </w:style>
-  <w:style w:type="paragraph" w:customStyle="1" w:styleId="PrayerItem2">
-    <w:name w:val="Prayer Item 2"/>
-    <w:basedOn w:val="BodyText"/>
-    <w:qFormat/>
-    <w:pPr>
-      <w:ind w:left="1680" w:firstLine="0"/>
-    </w:pPr>
-  </w:style>
-  <w:style w:type="paragraph" w:customStyle="1" w:styleId="SingleLine">
-    <w:name w:val="Single Line"/>
-    <w:basedOn w:val="Normal"/>
-    <w:qFormat/>
-    <w:pPr>
-      <w:spacing w:before="0" w:after="0" w:line="276" w:lineRule="exact"/>
-      <w:ind w:firstLine="0"/>
-      <w:jc w:val="left"/>
+      <w:widowControl w:val="0"/>
     </w:pPr>
   </w:style>
 </w:styles>

</xml_diff>